<commit_message>
test(native): cover full provider matrix and stage safe minimizer
</commit_message>
<xml_diff>
--- a/ARCHITECTURE.docx
+++ b/ARCHITECTURE.docx
@@ -949,6 +949,14 @@
     </w:p>
     <w:p>
       <w:pPr>
+        <w:pStyle w:val="Normal"/>
+      </w:pPr>
+      <w:r>
+        <w:t xml:space="preserve">Le Lab final couvre explicitement l'intégralité du catalogue : 96 providers et 214 routes déclarées sur les trois fixtures représentatives (82 movie + 92 tv + 40 anime). Une route/provider manquant rend le Lab incomplet. Les erreurs du lecteur officiel restent des observations de lecture : le Lab ne répare jamais NuvioTV/NuvioMobile/NuvioDesktop pour obtenir un vert artificiel.</w:t>
+      </w:r>
+    </w:p>
+    <w:p>
+      <w:pPr>
         <w:pStyle w:val="Heading1"/>
       </w:pPr>
       <w:r>
@@ -968,7 +976,15 @@
         <w:pStyle w:val="Normal"/>
       </w:pPr>
       <w:r>
-        <w:t xml:space="preserve">Tout futur minimizer doit être NiakVIO-aware et prouver qu'il conserve :</w:t>
+        <w:t xml:space="preserve">scripts/provider_v3_minimizer.py existe uniquement en mode audit/preview : il inventorie les 96 Provider JS, les marqueurs, commentaires, templates, lignes ASI-sensibles et le budget de whitespace. Il n'écrit jamais dans providers/ et aucune transformation n'est active dans la reconstruction/publication.</w:t>
+      </w:r>
+    </w:p>
+    <w:p>
+      <w:pPr>
+        <w:pStyle w:val="Normal"/>
+      </w:pPr>
+      <w:r>
+        <w:t xml:space="preserve">Avant toute activation, le minimizer devra être NiakVIO-aware et prouver qu'il conserve :</w:t>
       </w:r>
     </w:p>
     <w:p>
@@ -1000,6 +1016,30 @@
         <w:pStyle w:val="ListBullet"/>
       </w:pPr>
       <w:r>
+        <w:t xml:space="preserve">• commentaires structurels ;</w:t>
+      </w:r>
+    </w:p>
+    <w:p>
+      <w:pPr>
+        <w:pStyle w:val="ListBullet"/>
+      </w:pPr>
+      <w:r>
+        <w:t xml:space="preserve">• retours ligne tant que l'équivalence ASI n'est pas démontrée ;</w:t>
+      </w:r>
+    </w:p>
+    <w:p>
+      <w:pPr>
+        <w:pStyle w:val="ListBullet"/>
+      </w:pPr>
+      <w:r>
+        <w:t xml:space="preserve">• identifiants, expressions et littéraux sans renommage/réécriture ;</w:t>
+      </w:r>
+    </w:p>
+    <w:p>
+      <w:pPr>
+        <w:pStyle w:val="ListBullet"/>
+      </w:pPr>
+      <w:r>
         <w:t xml:space="preserve">• remplacement déterministe d'un Lego ;</w:t>
       </w:r>
     </w:p>
@@ -1008,7 +1048,7 @@
         <w:pStyle w:val="ListBullet"/>
       </w:pPr>
       <w:r>
-        <w:t xml:space="preserve">• équivalence fonctionnelle et reverse reconstruction.</w:t>
+        <w:t xml:space="preserve">• équivalence structurelle, runtime et reverse reconstruction.</w:t>
       </w:r>
     </w:p>
     <w:p>

</xml_diff>